<commit_message>
Xoa toan bo tai khoan test, reset trang CSDL va bat buoc mat khau phai co chu hoa, thuong, so, ky tu dac biet
</commit_message>
<xml_diff>
--- a/BÁO CÁO ĐỒ ÁN CHUYÊN NGÀNH - CHƯƠNG 2 - NHÓM 5.docx
+++ b/BÁO CÁO ĐỒ ÁN CHUYÊN NGÀNH - CHƯƠNG 2 - NHÓM 5.docx
@@ -976,17 +976,8 @@
             </w:tcMar>
           </w:tcPr>
           <w:p>
-            <w:pPr>
-              <w:spacing w:line="276" w:lineRule="auto" w:after="40"/>
-              <w:jc w:val="left"/>
-            </w:pPr>
-            <w:r/>
             <w:r>
-              <w:rPr>
-                <w:rFonts w:ascii="Times New Roman" w:hAnsi="Times New Roman"/>
-                <w:sz w:val="22"/>
-              </w:rPr>
-              <w:t>Đăng ký tài khoản mới; Đăng nhập với mật khẩu bảo mật băm SHA-256; Đăng nhập nhanh cho thành viên đồ án; Đăng xuất an toàn.</w:t>
+              <w:t>Đăng ký tài khoản mới (ràng buộc mật khẩu mạnh: chữ hoa, chữ thường, chữ số và ký tự đặc biệt); Đăng nhập với mật khẩu bảo mật băm SHA-256; Tính năng ghi nhớ mật khẩu (Remember Me); Đăng xuất an toàn.</w:t>
             </w:r>
           </w:p>
         </w:tc>

</xml_diff>

<commit_message>
revert(reports): Restore 100% original thesis Word documents from git history
</commit_message>
<xml_diff>
--- a/BÁO CÁO ĐỒ ÁN CHUYÊN NGÀNH - CHƯƠNG 2 - NHÓM 5.docx
+++ b/BÁO CÁO ĐỒ ÁN CHUYÊN NGÀNH - CHƯƠNG 2 - NHÓM 5.docx
@@ -1755,7 +1755,19 @@
         <w:jc w:val="both"/>
       </w:pPr>
       <w:r>
-        <w:t>4. Bảo mật dữ liệu, Cơ sở dữ liệu &amp; Quản lý phiên (Security, Database Isolation &amp; Session Management): Tệp tin Cơ sở dữ liệu vật lý (chat_database.db) và thư mục lưu trữ tệp đính kèm (uploads/) được cô lập tuyệt đối tại máy chủ Server nội bộ, được loại trừ hoàn toàn khỏi kho lưu trữ công khai GitHub (.gitignore: *.db, *.sqlite, uploads/). Nhờ đó, người ngoài khi tải mã nguồn phần mềm từ GitHub về chỉ nhận được bộ khung chương trình rỗng, không thể nào tiếp cận hay làm lộ dữ liệu tài khoản, tin nhắn của hệ thống máy chủ thật. Đồng thời, User ID sinh ngẫu nhiên 10 số bảo mật, mật khẩu băm SHA-256 + Salt và phiên đăng nhập đơn thiết bị kiểu Facebook ngăn chặn triệt để mọi nguy cơ rò rỉ dữ liệu.</w:t>
+        <w:rPr>
+          <w:rFonts w:ascii="Times New Roman" w:hAnsi="Times New Roman"/>
+          <w:b/>
+          <w:sz w:val="26"/>
+        </w:rPr>
+        <w:t xml:space="preserve">4. Bảo mật dữ liệu (Security): </w:t>
+      </w:r>
+      <w:r>
+        <w:rPr>
+          <w:rFonts w:ascii="Times New Roman" w:hAnsi="Times New Roman"/>
+          <w:sz w:val="26"/>
+        </w:rPr>
+        <w:t>Mật khẩu người dùng không được lưu trữ dưới dạng văn bản thuần (plaintext) mà bắt buộc phải băm bằng giải thuật SHA-256 kết hợp chuỗi salt bảo mật. Tệp tin tải lên máy chủ được gán mã định danh duy nhất (UUID) để tránh trùng lặp và ghi đè trái phép.</w:t>
       </w:r>
     </w:p>
     <w:p>
@@ -1787,7 +1799,19 @@
         <w:jc w:val="both"/>
       </w:pPr>
       <w:r>
-        <w:t>6. Tính dễ bảo trì, Nâng cấp &amp; Cập nhật trực tiếp (Live Seamless Update &amp; Portability): Ứng dụng tích hợp cơ chế tự động phát hiện phiên bản mới chạy ngầm (Background Live Update Checker). Khi quản trị viên đẩy mã nguồn mới lên GitHub, người dùng đang trực tiếp nhắn tin sẽ không bị văng (crash) ứng dụng; thay vào đó một huy hiệu nổi bật màu cam '🚀 Có Bản Cập Nhật Mới! (Cập nhật ngay)' sẽ xuất hiện trên thanh tiêu đề. Người dùng chỉ cần nhấp 1 chạm để hệ thống tự động tải và đồng bộ phiên bản mới rồi khởi động lại tức thì mà không gián đoạn dữ liệu.</w:t>
+        <w:rPr>
+          <w:rFonts w:ascii="Times New Roman" w:hAnsi="Times New Roman"/>
+          <w:b/>
+          <w:sz w:val="26"/>
+        </w:rPr>
+        <w:t xml:space="preserve">6. Tính dễ bảo trì &amp; Triển khai (Portability &amp; Maintainability): </w:t>
+      </w:r>
+      <w:r>
+        <w:rPr>
+          <w:rFonts w:ascii="Times New Roman" w:hAnsi="Times New Roman"/>
+          <w:sz w:val="26"/>
+        </w:rPr>
+        <w:t>Ứng dụng đóng gói kèm cơ chế tự động cài đặt ngầm thư viện và tự kích hoạt server trong suốt, không đòi hỏi người dùng phải cấu hình hệ quản trị CSDL phức tạp nhờ tích hợp sẵn SQLite nhỏ gọn.</w:t>
       </w:r>
     </w:p>
     <w:p>

</xml_diff>